<commit_message>
Rebuild Ch08 A New Birth of Freedom worksheets: add student work + teacher answer keys
Co-Authored-By: Claude Opus 4.8 <noreply@anthropic.com>
Claude-Session: https://claude.ai/code/session_015FDXZfxhU1Z58uEGaySNHv
</commit_message>
<xml_diff>
--- a/Part-Two-Ch08-A-New-Birth-of-Freedom/Appomattox.docx
+++ b/Part-Two-Ch08-A-New-Birth-of-Freedom/Appomattox.docx
@@ -9,25 +9,22 @@
         <w:tblLook w:firstColumn="1" w:firstRow="1" w:lastColumn="0" w:lastRow="0" w:noHBand="0" w:noVBand="1" w:val="04A0"/>
       </w:tblPr>
       <w:tblGrid>
-        <w:gridCol w:w="9936"/>
+        <w:gridCol w:w="10224"/>
       </w:tblGrid>
       <w:tr>
         <w:tc>
           <w:tcPr>
-            <w:tcW w:type="dxa" w:w="9936"/>
+            <w:tcW w:type="dxa" w:w="10224"/>
             <w:shd w:val="clear" w:fill="B1442F"/>
           </w:tcPr>
           <w:p>
-            <w:pPr>
-              <w:jc w:val="left"/>
-            </w:pPr>
             <w:r>
               <w:rPr>
                 <w:b/>
                 <w:color w:val="FFE6DE"/>
                 <w:sz w:val="18"/>
               </w:rPr>
-              <w:t>CHAPTER 8 · DEEP DIVE · A HOUSE DIVIDED</w:t>
+              <w:t>PROMISE &amp; PRACTICE  ·  DEEP DIVE  ·  SOURCE ANALYSIS</w:t>
             </w:r>
           </w:p>
           <w:p>
@@ -35,18 +32,19 @@
               <w:rPr>
                 <w:b/>
                 <w:color w:val="FFFFFF"/>
-                <w:sz w:val="40"/>
+                <w:sz w:val="42"/>
               </w:rPr>
-              <w:t>Appomattox</w:t>
+              <w:t>Appomattox — A House Divided</w:t>
             </w:r>
           </w:p>
           <w:p>
             <w:r>
               <w:rPr>
+                <w:i/>
                 <w:color w:val="FFE6DE"/>
-                <w:sz w:val="21"/>
+                <w:sz w:val="22"/>
               </w:rPr>
-              <w:t>How the war ended — not with vengeance, but with mercy. April 9, 1865.</w:t>
+              <w:t>A Surrender Without Vengeance</w:t>
             </w:r>
           </w:p>
         </w:tc>
@@ -64,7 +62,7 @@
         <w:rPr>
           <w:sz w:val="21"/>
         </w:rPr>
-        <w:t xml:space="preserve">__________________________    </w:t>
+        <w:t xml:space="preserve">______________________________    </w:t>
       </w:r>
       <w:r>
         <w:rPr>
@@ -90,30 +88,214 @@
         <w:rPr>
           <w:sz w:val="21"/>
         </w:rPr>
-        <w:t>______________</w:t>
+        <w:t>________________</w:t>
+      </w:r>
+    </w:p>
+    <w:tbl>
+      <w:tblPr>
+        <w:tblW w:type="auto" w:w="0"/>
+        <w:tblLayout w:type="autofit"/>
+        <w:tblLook w:firstColumn="1" w:firstRow="1" w:lastColumn="0" w:lastRow="0" w:noHBand="0" w:noVBand="1" w:val="04A0"/>
+      </w:tblPr>
+      <w:tblGrid>
+        <w:gridCol w:w="10224"/>
+      </w:tblGrid>
+      <w:tr>
+        <w:tc>
+          <w:tcPr>
+            <w:tcW w:type="dxa" w:w="10224"/>
+            <w:shd w:val="clear" w:fill="f4c04e"/>
+          </w:tcPr>
+          <w:p>
+            <w:r>
+              <w:rPr>
+                <w:b/>
+                <w:color w:val="5A4512"/>
+                <w:sz w:val="19"/>
+              </w:rPr>
+              <w:t xml:space="preserve">WHAT I CAN DO TODAY   </w:t>
+            </w:r>
+            <w:r>
+              <w:rPr>
+                <w:color w:val="5A4512"/>
+                <w:sz w:val="21"/>
+              </w:rPr>
+              <w:t>I can read primary sources about Appomattox — A House Divided, weigh who made each one and why, and use evidence to answer historical questions.</w:t>
+            </w:r>
+          </w:p>
+        </w:tc>
+      </w:tr>
+    </w:tbl>
+    <w:p>
+      <w:r>
+        <w:rPr>
+          <w:b/>
+          <w:color w:val="B1442F"/>
+        </w:rPr>
+        <w:t xml:space="preserve">Directions. </w:t>
+      </w:r>
+      <w:r>
+        <w:rPr>
+          <w:sz w:val="22"/>
+        </w:rPr>
+        <w:t>The same moment looks different from each chair in the room. Read the points of view, then judge the choice</w:t>
       </w:r>
     </w:p>
     <w:p/>
     <w:p>
       <w:r>
         <w:rPr>
+          <w:b/>
+          <w:color w:val="B1442F"/>
+          <w:sz w:val="26"/>
+        </w:rPr>
+        <w:t>THE SOURCES</w:t>
+      </w:r>
+    </w:p>
+    <w:p>
+      <w:pPr>
+        <w:spacing w:before="160"/>
+      </w:pPr>
+      <w:r>
+        <w:rPr>
+          <w:b/>
+          <w:color w:val="1C1714"/>
+          <w:sz w:val="23"/>
+        </w:rPr>
+        <w:t>THE IMAGE · APRIL 1865  —  The surrender</w:t>
+      </w:r>
+    </w:p>
+    <w:p>
+      <w:pPr>
+        <w:jc w:val="center"/>
+      </w:pPr>
+      <w:r>
+        <w:drawing>
+          <wp:inline xmlns:a="http://schemas.openxmlformats.org/drawingml/2006/main" xmlns:pic="http://schemas.openxmlformats.org/drawingml/2006/picture">
+            <wp:extent cx="3931920" cy="3114050"/>
+            <wp:docPr id="1" name="Picture 1"/>
+            <wp:cNvGraphicFramePr>
+              <a:graphicFrameLocks noChangeAspect="1"/>
+            </wp:cNvGraphicFramePr>
+            <a:graphic>
+              <a:graphicData uri="http://schemas.openxmlformats.org/drawingml/2006/picture">
+                <pic:pic>
+                  <pic:nvPicPr>
+                    <pic:cNvPr id="0" name="image.jpg"/>
+                    <pic:cNvPicPr/>
+                  </pic:nvPicPr>
+                  <pic:blipFill>
+                    <a:blip r:embed="rId9"/>
+                    <a:stretch>
+                      <a:fillRect/>
+                    </a:stretch>
+                  </pic:blipFill>
+                  <pic:spPr>
+                    <a:xfrm>
+                      <a:off x="0" y="0"/>
+                      <a:ext cx="3931920" cy="3114050"/>
+                    </a:xfrm>
+                    <a:prstGeom prst="rect"/>
+                  </pic:spPr>
+                </pic:pic>
+              </a:graphicData>
+            </a:graphic>
+          </wp:inline>
+        </w:drawing>
+      </w:r>
+    </w:p>
+    <w:p>
+      <w:r>
+        <w:rPr>
+          <w:color w:val="6A6256"/>
+          <w:sz w:val="17"/>
+        </w:rPr>
+        <w:t>“The Surrender of General Lee, April 9, 1865” — lithograph, public domain (Library of Congress).</w:t>
+      </w:r>
+    </w:p>
+    <w:p>
+      <w:pPr>
+        <w:spacing w:before="160"/>
+      </w:pPr>
+      <w:r>
+        <w:rPr>
+          <w:b/>
+          <w:color w:val="1C1714"/>
+          <w:sz w:val="23"/>
+        </w:rPr>
+        <w:t>SOURCE A · GRANT'S POINT OF VIEW · MEMOIRS  —  The victor</w:t>
+      </w:r>
+    </w:p>
+    <w:p>
+      <w:pPr>
+        <w:ind w:left="432"/>
+      </w:pPr>
+      <w:r>
+        <w:rPr>
           <w:i/>
           <w:color w:val="1C1714"/>
           <w:sz w:val="22"/>
         </w:rPr>
-        <w:t>How the war ended — not with vengeance, but with mercy. April 9, 1865.</w:t>
+        <w:t>“I felt … sad and depressed … at the downfall of a foe who had fought so long and valiantly … The much talked of surrendering of Lee's sword and my handing it back, this and much more that has been said about it is the purest romance. … [I told my men] the war is over; the rebels are our countrymen again.”</w:t>
+        <w:br/>
+        <w:t>— Ulysses S. Grant, Personal Memoirs. Public domain</w:t>
+      </w:r>
+    </w:p>
+    <w:p>
+      <w:r>
+        <w:rPr>
+          <w:color w:val="6A6256"/>
+          <w:sz w:val="17"/>
+        </w:rPr>
+        <w:t>— Ulysses S. Grant, Personal Memoirs. Public domain.</w:t>
       </w:r>
     </w:p>
     <w:p>
       <w:pPr>
-        <w:spacing w:after="80"/>
+        <w:spacing w:before="160"/>
       </w:pPr>
       <w:r>
         <w:rPr>
+          <w:b/>
           <w:color w:val="1C1714"/>
           <w:sz w:val="23"/>
         </w:rPr>
-        <w:t>When you have finally defeated an enemy who nearly destroyed your nation, how should you treat them?</w:t>
+        <w:t>SOURCE B · A UNION OFFICER'S POINT OF VIEW · AT THE STACKING OF ARMS  —  The salute</w:t>
+      </w:r>
+    </w:p>
+    <w:p>
+      <w:pPr>
+        <w:ind w:left="432"/>
+      </w:pPr>
+      <w:r>
+        <w:rPr>
+          <w:i/>
+          <w:color w:val="1C1714"/>
+          <w:sz w:val="22"/>
+        </w:rPr>
+        <w:t>“… before us in proud humiliation stood the embodiment of manhood … Was not such manhood to be welcomed back into a Union so tested and assured? … [we gave them] the soldier's salutation, from the 'order arms' to the old 'carry' — the marching salute.”</w:t>
+        <w:br/>
+        <w:t>— Gen. Joshua Chamberlain, remembering the surrender. Public domain</w:t>
+      </w:r>
+    </w:p>
+    <w:p>
+      <w:r>
+        <w:rPr>
+          <w:color w:val="6A6256"/>
+          <w:sz w:val="17"/>
+        </w:rPr>
+        <w:t>— Gen. Joshua Chamberlain, remembering the surrender. Public domain.</w:t>
+      </w:r>
+    </w:p>
+    <w:p/>
+    <w:p>
+      <w:r>
+        <w:rPr>
+          <w:b/>
+          <w:color w:val="B1442F"/>
+          <w:sz w:val="26"/>
+        </w:rPr>
+        <w:t>YOUR WORK</w:t>
       </w:r>
     </w:p>
     <w:p>
@@ -123,54 +305,65 @@
       <w:r>
         <w:rPr>
           <w:b/>
-          <w:color w:val="B1442F"/>
-          <w:sz w:val="28"/>
+          <w:color w:val="FFFFFF"/>
+          <w:sz w:val="20"/>
+          <w:shd w:val="clear" w:fill="B1442F"/>
         </w:rPr>
-        <w:t>The End of the Road</w:t>
+        <w:t xml:space="preserve">  QUESTION 1  </w:t>
+      </w:r>
+      <w:r>
+        <w:rPr>
+          <w:b/>
+          <w:color w:val="6A6256"/>
+          <w:sz w:val="18"/>
+        </w:rPr>
+        <w:t xml:space="preserve">   STEP 1 · THE TERMS</w:t>
       </w:r>
     </w:p>
     <w:p>
       <w:r>
         <w:rPr>
-          <w:b/>
-          <w:color w:val="6A6256"/>
-          <w:sz w:val="17"/>
+          <w:b w:val="0"/>
+          <w:color w:val="1C1714"/>
+          <w:sz w:val="23"/>
         </w:rPr>
-        <w:t>APRIL 1865</w:t>
+        <w:t>List three specific ways Grant's surrender terms were generous rather than punishing. (Think about parole, sidearms, horses, rations.)</w:t>
       </w:r>
     </w:p>
     <w:p>
       <w:pPr>
-        <w:spacing w:after="80"/>
+        <w:spacing w:after="120"/>
       </w:pPr>
       <w:r>
         <w:rPr>
-          <w:color w:val="1C1714"/>
-          <w:sz w:val="23"/>
+          <w:color w:val="9A9286"/>
+          <w:sz w:val="22"/>
         </w:rPr>
-        <w:t>After abandoning Petersburg, Lee's starving, shrinking army fled west, hoping to escape and fight on. Grant's forces cut them off at every turn. Within a week, Lee was trapped near a small Virginia village called Appomattox Court House.</w:t>
+        <w:t>____________________________________________________________________________________________</w:t>
       </w:r>
     </w:p>
     <w:p>
       <w:pPr>
-        <w:spacing w:after="80"/>
+        <w:spacing w:after="120"/>
       </w:pPr>
       <w:r>
         <w:rPr>
-          <w:color w:val="1C1714"/>
-          <w:sz w:val="23"/>
+          <w:color w:val="9A9286"/>
+          <w:sz w:val="22"/>
         </w:rPr>
-        <w:t>His army was down to fewer than 30,000 exhausted men, surrounded and out of supplies. On April 9, 1865, Lee agreed to meet Grant to surrender.</w:t>
+        <w:t>____________________________________________________________________________________________</w:t>
       </w:r>
     </w:p>
     <w:p>
+      <w:pPr>
+        <w:spacing w:after="120"/>
+      </w:pPr>
       <w:r>
         <w:rPr>
-          <w:i/>
-          <w:color w:val="6A6256"/>
-          <w:sz w:val="17"/>
+          <w:color w:val="9A9286"/>
+          <w:sz w:val="22"/>
         </w:rPr>
-        <w:t>The McLean House, Appomattox Court House, Virginia — scene of Lee’s surrender — photograph, 1865, public domain (Library of Congress).</w:t>
+        <w:t>____________________________________________________________________________________________</w:t>
       </w:r>
     </w:p>
     <w:p>
@@ -180,40 +373,77 @@
       <w:r>
         <w:rPr>
           <w:b/>
-          <w:color w:val="B1442F"/>
-          <w:sz w:val="28"/>
+          <w:color w:val="FFFFFF"/>
+          <w:sz w:val="20"/>
+          <w:shd w:val="clear" w:fill="B1442F"/>
         </w:rPr>
-        <w:t>The House Where the War Ended</w:t>
+        <w:t xml:space="preserve">  QUESTION 2  </w:t>
+      </w:r>
+      <w:r>
+        <w:rPr>
+          <w:b/>
+          <w:color w:val="6A6256"/>
+          <w:sz w:val="18"/>
+        </w:rPr>
+        <w:t xml:space="preserve">   STEP 2 · WHY MERCY?</w:t>
       </w:r>
     </w:p>
     <w:p>
       <w:r>
         <w:rPr>
-          <w:b/>
-          <w:color w:val="6A6256"/>
-          <w:sz w:val="17"/>
+          <w:b w:val="0"/>
+          <w:color w:val="1C1714"/>
+          <w:sz w:val="23"/>
         </w:rPr>
-        <w:t>APPOMATTOX COURT HOUSE, VA.</w:t>
+        <w:t>Why would Grant and Lincoln choose generous terms instead of harsh punishment?</w:t>
       </w:r>
     </w:p>
     <w:p>
+      <w:pPr>
+        <w:spacing w:after="40"/>
+        <w:ind w:left="432"/>
+      </w:pPr>
       <w:r>
         <w:rPr>
-          <w:i/>
-          <w:color w:val="1C1714"/>
           <w:sz w:val="22"/>
         </w:rPr>
-        <w:t>The two generals met in the parlor of Wilmer McLean's home. By a strange twist, McLean had moved to Appomattox to escape the war after the first battle of Bull Run was fought on his earlier farm.</w:t>
+        <w:t>☐  A.  they were afraid of Lee</w:t>
       </w:r>
     </w:p>
     <w:p>
+      <w:pPr>
+        <w:spacing w:after="40"/>
+        <w:ind w:left="432"/>
+      </w:pPr>
       <w:r>
         <w:rPr>
-          <w:i/>
-          <w:color w:val="6A6256"/>
-          <w:sz w:val="17"/>
+          <w:sz w:val="22"/>
         </w:rPr>
-        <w:t>The McLean House, Appomattox Court House, Virginia — scene of Lee's surrender — photograph, 1865, public domain (Library of Congress).</w:t>
+        <w:t>☐  B.  they wanted the war to continue</w:t>
+      </w:r>
+    </w:p>
+    <w:p>
+      <w:pPr>
+        <w:spacing w:after="40"/>
+        <w:ind w:left="432"/>
+      </w:pPr>
+      <w:r>
+        <w:rPr>
+          <w:sz w:val="22"/>
+        </w:rPr>
+        <w:t>☐  C.  their goal was to reunite the country, and mercy would help it heal</w:t>
+      </w:r>
+    </w:p>
+    <w:p>
+      <w:pPr>
+        <w:spacing w:after="40"/>
+        <w:ind w:left="432"/>
+      </w:pPr>
+      <w:r>
+        <w:rPr>
+          <w:sz w:val="22"/>
+        </w:rPr>
+        <w:t>☐  D.  Congress forced them to</w:t>
       </w:r>
     </w:p>
     <w:p>
@@ -223,54 +453,77 @@
       <w:r>
         <w:rPr>
           <w:b/>
-          <w:color w:val="B1442F"/>
-          <w:sz w:val="28"/>
+          <w:color w:val="FFFFFF"/>
+          <w:sz w:val="20"/>
+          <w:shd w:val="clear" w:fill="B1442F"/>
         </w:rPr>
-        <w:t>Generous in Victory</w:t>
+        <w:t xml:space="preserve">  QUESTION 3  </w:t>
+      </w:r>
+      <w:r>
+        <w:rPr>
+          <w:b/>
+          <w:color w:val="6A6256"/>
+          <w:sz w:val="18"/>
+        </w:rPr>
+        <w:t xml:space="preserve">   STEP 3 · TWO POINTS OF VIEW</w:t>
       </w:r>
     </w:p>
     <w:p>
       <w:r>
         <w:rPr>
-          <w:b/>
-          <w:color w:val="6A6256"/>
-          <w:sz w:val="17"/>
+          <w:b w:val="0"/>
+          <w:color w:val="1C1714"/>
+          <w:sz w:val="23"/>
         </w:rPr>
-        <w:t>THE TERMS</w:t>
+        <w:t>Using Sources A and B, describe how the Union side viewed the defeated Confederates. Then imagine the Confederate soldiers' point of view as they surrendered. How might the same moment have felt very different to each?</w:t>
       </w:r>
     </w:p>
     <w:p>
       <w:pPr>
-        <w:spacing w:after="80"/>
+        <w:spacing w:after="120"/>
       </w:pPr>
       <w:r>
         <w:rPr>
-          <w:color w:val="1C1714"/>
-          <w:sz w:val="23"/>
+          <w:color w:val="9A9286"/>
+          <w:sz w:val="22"/>
         </w:rPr>
-        <w:t>Grant could have demanded a humiliating, punishing surrender. Instead, following Lincoln's spirit of “malice toward none,” he offered generous terms. Confederate soldiers would be paroled and sent home, not imprisoned. Officers could keep their sidearms; men who owned horses could keep them for spring plowing.</w:t>
+        <w:t>____________________________________________________________________________________________</w:t>
       </w:r>
     </w:p>
     <w:p>
       <w:pPr>
-        <w:spacing w:after="80"/>
+        <w:spacing w:after="120"/>
       </w:pPr>
       <w:r>
         <w:rPr>
-          <w:color w:val="1C1714"/>
-          <w:sz w:val="23"/>
+          <w:color w:val="9A9286"/>
+          <w:sz w:val="22"/>
         </w:rPr>
-        <w:t>When Union troops began to celebrate, Grant ordered them to stop — “The war is over,” he said; “the rebels are our countrymen again.” He even sent rations to feed Lee's hungry men.</w:t>
+        <w:t>____________________________________________________________________________________________</w:t>
       </w:r>
     </w:p>
     <w:p>
+      <w:pPr>
+        <w:spacing w:after="120"/>
+      </w:pPr>
       <w:r>
         <w:rPr>
-          <w:i/>
-          <w:color w:val="6A6256"/>
-          <w:sz w:val="17"/>
+          <w:color w:val="9A9286"/>
+          <w:sz w:val="22"/>
         </w:rPr>
-        <w:t>Lt. Gen. Ulysses S. Grant and Gen. Robert E. Lee — photographs, 1864–65, public domain (Library of Congress).</w:t>
+        <w:t>____________________________________________________________________________________________</w:t>
+      </w:r>
+    </w:p>
+    <w:p>
+      <w:pPr>
+        <w:spacing w:after="120"/>
+      </w:pPr>
+      <w:r>
+        <w:rPr>
+          <w:color w:val="9A9286"/>
+          <w:sz w:val="22"/>
+        </w:rPr>
+        <w:t>____________________________________________________________________________________________</w:t>
       </w:r>
     </w:p>
     <w:p>
@@ -280,141 +533,91 @@
       <w:r>
         <w:rPr>
           <w:b/>
-          <w:color w:val="B1442F"/>
-          <w:sz w:val="28"/>
+          <w:color w:val="FFFFFF"/>
+          <w:sz w:val="20"/>
+          <w:shd w:val="clear" w:fill="B1442F"/>
         </w:rPr>
-        <w:t>Grant and Lee</w:t>
+        <w:t xml:space="preserve">  QUESTION 4  </w:t>
+      </w:r>
+      <w:r>
+        <w:rPr>
+          <w:b/>
+          <w:color w:val="6A6256"/>
+          <w:sz w:val="18"/>
+        </w:rPr>
+        <w:t xml:space="preserve">   STEP 4 · JUDGE THE CHOICE</w:t>
       </w:r>
     </w:p>
     <w:p>
       <w:r>
         <w:rPr>
-          <w:b/>
-          <w:color w:val="6A6256"/>
-          <w:sz w:val="17"/>
+          <w:b w:val="0"/>
+          <w:color w:val="1C1714"/>
+          <w:sz w:val="23"/>
         </w:rPr>
-        <w:t>THE TWO COMMANDERS</w:t>
-      </w:r>
-    </w:p>
-    <w:p>
-      <w:r>
-        <w:rPr>
-          <w:i/>
-          <w:color w:val="1C1714"/>
-          <w:sz w:val="22"/>
-        </w:rPr>
-        <w:t>The victor and the vanquished. Grant, in a mud-spattered field coat, had hounded Lee's army to exhaustion; Lee, in his finest dress uniform, came to give it up. Their meeting set the tone for the peace.</w:t>
-      </w:r>
-    </w:p>
-    <w:p>
-      <w:r>
-        <w:rPr>
-          <w:i/>
-          <w:color w:val="6A6256"/>
-          <w:sz w:val="17"/>
-        </w:rPr>
-        <w:t>Lt. Gen. Ulysses S. Grant and Gen. Robert E. Lee — photographs, 1864–65, public domain (Library of Congress).</w:t>
+        <w:t>Some argue the generous terms helped heal the nation; others argue they let the old Southern order off too easily, setting up the troubles of Reconstruction. In three or four sentences, argue which view you find more convincing.</w:t>
       </w:r>
     </w:p>
     <w:p>
       <w:pPr>
-        <w:spacing w:before="200"/>
+        <w:spacing w:after="120"/>
       </w:pPr>
       <w:r>
         <w:rPr>
-          <w:b/>
-          <w:color w:val="B1442F"/>
-          <w:sz w:val="28"/>
-        </w:rPr>
-        <w:t>“Their Hearts … Must Have Been Sad”</w:t>
-      </w:r>
-    </w:p>
-    <w:p>
-      <w:r>
-        <w:rPr>
-          <w:b/>
-          <w:color w:val="6A6256"/>
-          <w:sz w:val="17"/>
-        </w:rPr>
-        <w:t>APRIL 9, 1865</w:t>
-      </w:r>
-    </w:p>
-    <w:p>
-      <w:r>
-        <w:rPr>
-          <w:i/>
-          <w:color w:val="1C1714"/>
+          <w:color w:val="9A9286"/>
           <w:sz w:val="22"/>
         </w:rPr>
-        <w:t>Later prints imagined the quiet dignity of the meeting — Lee in a crisp dress uniform, Grant in a mud-spattered field coat. Two men ending four years of war with a handshake.</w:t>
-      </w:r>
-    </w:p>
-    <w:p>
-      <w:r>
-        <w:rPr>
-          <w:i/>
-          <w:color w:val="6A6256"/>
-          <w:sz w:val="17"/>
-        </w:rPr>
-        <w:t>“The Surrender of General Lee, April 9, 1865” — lithograph, public domain (Library of Congress).</w:t>
-      </w:r>
-    </w:p>
-    <w:p>
-      <w:r>
-        <w:rPr>
-          <w:b/>
-          <w:color w:val="6A6256"/>
-          <w:sz w:val="17"/>
-        </w:rPr>
-        <w:t>ULYSSES S. GRANT, ON SEEING LEE SURRENDER</w:t>
+        <w:t>____________________________________________________________________________________________</w:t>
       </w:r>
     </w:p>
     <w:p>
       <w:pPr>
-        <w:spacing w:after="80"/>
+        <w:spacing w:after="120"/>
       </w:pPr>
       <w:r>
         <w:rPr>
-          <w:color w:val="1C1714"/>
-          <w:sz w:val="23"/>
+          <w:color w:val="9A9286"/>
+          <w:sz w:val="22"/>
         </w:rPr>
-        <w:t>I felt … sad and depressed at the downfall of a foe who had fought so long and valiantly, and had suffered so much for a cause, though that cause was, I believe, one of the worst for which a people ever fought.</w:t>
+        <w:t>____________________________________________________________________________________________</w:t>
       </w:r>
     </w:p>
     <w:p>
       <w:pPr>
-        <w:spacing w:before="200"/>
+        <w:spacing w:after="120"/>
       </w:pPr>
       <w:r>
         <w:rPr>
-          <w:b/>
-          <w:color w:val="B1442F"/>
-          <w:sz w:val="28"/>
+          <w:color w:val="9A9286"/>
+          <w:sz w:val="22"/>
         </w:rPr>
-        <w:t>See It From Both Sides</w:t>
+        <w:t>____________________________________________________________________________________________</w:t>
       </w:r>
     </w:p>
     <w:p>
+      <w:pPr>
+        <w:spacing w:after="120"/>
+      </w:pPr>
       <w:r>
         <w:rPr>
-          <w:b/>
-          <w:color w:val="6A6256"/>
-          <w:sz w:val="17"/>
+          <w:color w:val="9A9286"/>
+          <w:sz w:val="22"/>
         </w:rPr>
-        <w:t>YOUR TURN</w:t>
+        <w:t>____________________________________________________________________________________________</w:t>
       </w:r>
     </w:p>
     <w:p>
+      <w:pPr>
+        <w:spacing w:after="120"/>
+      </w:pPr>
       <w:r>
         <w:rPr>
-          <w:i/>
-          <w:color w:val="1C1714"/>
+          <w:color w:val="9A9286"/>
           <w:sz w:val="22"/>
         </w:rPr>
-        <w:t>You'll read how Grant and others remembered Appomattox and practice point of view — understanding why the victors chose mercy, and what that choice was meant to accomplish.</w:t>
+        <w:t>____________________________________________________________________________________________</w:t>
       </w:r>
     </w:p>
-    <w:p/>
     <w:p>
       <w:pPr>
         <w:jc w:val="center"/>
@@ -427,9 +630,160 @@
         <w:t>Promise &amp; Practice · ShadowDog Digital Studios · Unit 2</w:t>
       </w:r>
     </w:p>
+    <w:p>
+      <w:r>
+        <w:br w:type="page"/>
+      </w:r>
+    </w:p>
+    <w:tbl>
+      <w:tblPr>
+        <w:tblW w:type="auto" w:w="0"/>
+        <w:tblLayout w:type="autofit"/>
+        <w:tblLook w:firstColumn="1" w:firstRow="1" w:lastColumn="0" w:lastRow="0" w:noHBand="0" w:noVBand="1" w:val="04A0"/>
+      </w:tblPr>
+      <w:tblGrid>
+        <w:gridCol w:w="10224"/>
+      </w:tblGrid>
+      <w:tr>
+        <w:tc>
+          <w:tcPr>
+            <w:tcW w:type="dxa" w:w="10224"/>
+            <w:shd w:val="clear" w:fill="2c2219"/>
+          </w:tcPr>
+          <w:p>
+            <w:r>
+              <w:rPr>
+                <w:b/>
+                <w:color w:val="F0A184"/>
+                <w:sz w:val="28"/>
+              </w:rPr>
+              <w:t>TEACHER ANSWER KEY  —  Appomattox — A House Divided</w:t>
+            </w:r>
+          </w:p>
+        </w:tc>
+      </w:tr>
+    </w:tbl>
+    <w:p/>
+    <w:p>
+      <w:r>
+        <w:rPr>
+          <w:b/>
+          <w:color w:val="B1442F"/>
+          <w:sz w:val="22"/>
+        </w:rPr>
+        <w:t xml:space="preserve">QUESTION 1:  </w:t>
+      </w:r>
+      <w:r>
+        <w:rPr>
+          <w:sz w:val="22"/>
+        </w:rPr>
+        <w:t>Open response.</w:t>
+      </w:r>
+    </w:p>
+    <w:p>
+      <w:pPr>
+        <w:ind w:left="432"/>
+      </w:pPr>
+      <w:r>
+        <w:rPr>
+          <w:i/>
+          <w:color w:val="6A6256"/>
+          <w:sz w:val="21"/>
+        </w:rPr>
+        <w:t>Look for a response along the lines of: “1)… 2)… 3)…”</w:t>
+      </w:r>
+    </w:p>
+    <w:p>
+      <w:r>
+        <w:rPr>
+          <w:b/>
+          <w:color w:val="B1442F"/>
+          <w:sz w:val="22"/>
+        </w:rPr>
+        <w:t xml:space="preserve">QUESTION 2:  </w:t>
+      </w:r>
+      <w:r>
+        <w:rPr>
+          <w:b/>
+          <w:sz w:val="22"/>
+        </w:rPr>
+        <w:t>Correct — C. their goal was to reunite the country, and mercy would help it heal</w:t>
+      </w:r>
+    </w:p>
+    <w:p>
+      <w:pPr>
+        <w:ind w:left="432"/>
+      </w:pPr>
+      <w:r>
+        <w:rPr>
+          <w:i/>
+          <w:color w:val="6A6256"/>
+          <w:sz w:val="21"/>
+        </w:rPr>
+        <w:t>Right. The goal now was to reunite the country. Humiliating the South would deepen the wounds; treating the defeated as “countrymen again” was meant to help heal the nation.</w:t>
+      </w:r>
+    </w:p>
+    <w:p>
+      <w:r>
+        <w:rPr>
+          <w:b/>
+          <w:color w:val="B1442F"/>
+          <w:sz w:val="22"/>
+        </w:rPr>
+        <w:t xml:space="preserve">QUESTION 3:  </w:t>
+      </w:r>
+      <w:r>
+        <w:rPr>
+          <w:sz w:val="22"/>
+        </w:rPr>
+        <w:t>Open response.</w:t>
+      </w:r>
+    </w:p>
+    <w:p>
+      <w:pPr>
+        <w:ind w:left="432"/>
+      </w:pPr>
+      <w:r>
+        <w:rPr>
+          <w:i/>
+          <w:color w:val="6A6256"/>
+          <w:sz w:val="21"/>
+        </w:rPr>
+        <w:t>Look for a response along the lines of: “The Union soldiers saw…; the Confederate soldiers may have felt…”</w:t>
+      </w:r>
+    </w:p>
+    <w:p>
+      <w:r>
+        <w:rPr>
+          <w:b/>
+          <w:color w:val="B1442F"/>
+          <w:sz w:val="22"/>
+        </w:rPr>
+        <w:t xml:space="preserve">QUESTION 4:  </w:t>
+      </w:r>
+      <w:r>
+        <w:rPr>
+          <w:sz w:val="22"/>
+        </w:rPr>
+        <w:t>Open response.</w:t>
+      </w:r>
+    </w:p>
+    <w:p>
+      <w:pPr>
+        <w:ind w:left="432"/>
+      </w:pPr>
+      <w:r>
+        <w:rPr>
+          <w:i/>
+          <w:color w:val="6A6256"/>
+          <w:sz w:val="21"/>
+        </w:rPr>
+        <w:t>Look for a response along the lines of: “I find ___ more convincing because…”</w:t>
+      </w:r>
+    </w:p>
     <w:sectPr>
       <w:pgSz w:w="12240" w:h="15840"/>
-      <w:pgMar w:top="1152" w:right="1152" w:bottom="1152" w:left="1152" w:header="720" w:footer="720" w:gutter="0"/>
+      <w:pgMar w:top="1008" w:right="1008" w:bottom="1008" w:left="1008" w:header="720" w:footer="720" w:gutter="0"/>
       <w:cols w:space="720"/>
       <w:docGrid w:linePitch="360"/>
     </w:sectPr>

</xml_diff>